<commit_message>
docs: add assigned unit-cube worked example
</commit_message>
<xml_diff>
--- a/docs/空间任意力系简化程序设计报告.docx
+++ b/docs/空间任意力系简化程序设计报告.docx
@@ -27,7 +27,7 @@
         <w:rPr>
           <w:b w:val="0"/>
         </w:rPr>
-        <w:t>报告日期  2026年10月16日    程序基线  3785ddd</w:t>
+        <w:t>报告更新  2026年10月18日    程序基线  3785ddd</w:t>
       </w:r>
     </w:p>
     <w:p>
@@ -59,7 +59,7 @@
         <w:rPr>
           <w:b w:val="0"/>
         </w:rPr>
-        <w:t>程序采用 Python 标准库 tkinter 构建桌面界面，以三维正交投影展示载荷、简化点和等效结果。用户可旋转、缩放和平移场景，并保存项目或导出报告与矢量图。四类运行实例与重新执行的自动化测试共同核验了计算结果。</w:t>
+        <w:t>程序采用 Python 标准库 tkinter 构建桌面界面，以三维正交投影展示载荷、简化点和等效结果。用户可旋转、缩放和平移场景，并保存项目或导出报告与矢量图。报告首先复现题目指定的正方体力系实例，再通过四类补充算例与自动化测试核验计算结果。</w:t>
       </w:r>
     </w:p>
     <w:p>
@@ -3550,7 +3550,2198 @@
         <w:pageBreakBefore/>
       </w:pPr>
       <w:r>
-        <w:t>八 运行实例 单一合力</w:t>
+        <w:t>八 指定运行实例 正方体力系</w:t>
+      </w:r>
+    </w:p>
+    <w:p>
+      <w:pPr>
+        <w:pStyle w:val="Heading2"/>
+      </w:pPr>
+      <w:r>
+        <w:t>题目与坐标约定</w:t>
+      </w:r>
+    </w:p>
+    <w:p>
+      <w:pPr>
+        <w:widowControl/>
+        <w:spacing w:after="120"/>
+      </w:pPr>
+      <w:r>
+        <w:rPr>
+          <w:b w:val="0"/>
+        </w:rPr>
+        <w:t>如图所示，正方体边长为 1 m，F1=F3=1 N，F2=F4=√2 N。求该力系向 O 点简化的结果，以及力系的最终简化结果。本例使用题图给定的右手直角坐标系，O 为后下方隐藏顶点。</w:t>
+      </w:r>
+    </w:p>
+    <w:p>
+      <w:pPr>
+        <w:keepNext/>
+        <w:spacing w:after="0" w:before="0" w:line="240" w:lineRule="auto"/>
+        <w:jc w:val="center"/>
+      </w:pPr>
+      <w:r>
+        <w:drawing>
+          <wp:inline xmlns:a="http://schemas.openxmlformats.org/drawingml/2006/main" xmlns:pic="http://schemas.openxmlformats.org/drawingml/2006/picture">
+            <wp:extent cx="2788920" cy="2529694"/>
+            <wp:docPr id="4" name="Picture 4" descr="用户提供的指定例题图，四个力作用在单位正方体的棱线和面对角线上，原点为隐藏的后下方顶点 O。"/>
+            <wp:cNvGraphicFramePr>
+              <a:graphicFrameLocks noChangeAspect="1"/>
+            </wp:cNvGraphicFramePr>
+            <a:graphic>
+              <a:graphicData uri="http://schemas.openxmlformats.org/drawingml/2006/picture">
+                <pic:pic>
+                  <pic:nvPicPr>
+                    <pic:cNvPr id="0" name="cube_problem.png"/>
+                    <pic:cNvPicPr/>
+                  </pic:nvPicPr>
+                  <pic:blipFill>
+                    <a:blip r:embed="rId13"/>
+                    <a:stretch>
+                      <a:fillRect/>
+                    </a:stretch>
+                  </pic:blipFill>
+                  <pic:spPr>
+                    <a:xfrm>
+                      <a:off x="0" y="0"/>
+                      <a:ext cx="2788920" cy="2529694"/>
+                    </a:xfrm>
+                    <a:prstGeom prst="rect"/>
+                  </pic:spPr>
+                </pic:pic>
+              </a:graphicData>
+            </a:graphic>
+          </wp:inline>
+        </w:drawing>
+      </w:r>
+    </w:p>
+    <w:p>
+      <w:pPr>
+        <w:pStyle w:val="Caption"/>
+        <w:keepNext w:val="0"/>
+        <w:spacing w:before="60" w:after="160"/>
+        <w:jc w:val="center"/>
+      </w:pPr>
+      <w:r>
+        <w:t>图 4 题目指定的正方体力系</w:t>
+      </w:r>
+    </w:p>
+    <w:p>
+      <w:pPr>
+        <w:widowControl/>
+        <w:spacing w:after="120"/>
+      </w:pPr>
+      <w:r>
+        <w:rPr>
+          <w:b w:val="0"/>
+        </w:rPr>
+        <w:t>以 O=(0,0,0) 为原点，沿图中 x、y、z 正方向取坐标。前下左顶点为 (1,0,0)，前下右顶点为 (1,1,0)，后下右顶点为 (0,1,0)，后上左顶点为 (0,0,1)，坐标单位均为 m。</w:t>
+      </w:r>
+    </w:p>
+    <w:p>
+      <w:pPr>
+        <w:pStyle w:val="Heading2"/>
+      </w:pPr>
+      <w:r>
+        <w:t>由大小与作用线确定输入分量</w:t>
+      </w:r>
+    </w:p>
+    <w:tbl>
+      <w:tblPr>
+        <w:tblW w:type="auto" w:w="0"/>
+        <w:jc w:val="center"/>
+        <w:tblLayout w:type="fixed"/>
+        <w:tblLook w:firstColumn="1" w:firstRow="1" w:lastColumn="0" w:lastRow="0" w:noHBand="0" w:noVBand="1" w:val="04A0"/>
+        <w:tblBorders>
+          <w:top w:val="single" w:sz="4" w:color="D9D9D9"/>
+          <w:left w:val="single" w:sz="4" w:color="D9D9D9"/>
+          <w:bottom w:val="single" w:sz="4" w:color="D9D9D9"/>
+          <w:right w:val="single" w:sz="4" w:color="D9D9D9"/>
+          <w:insideH w:val="single" w:sz="4" w:color="D9D9D9"/>
+          <w:insideV w:val="single" w:sz="4" w:color="D9D9D9"/>
+        </w:tblBorders>
+        <w:tblCellMar>
+          <w:top w:w="95" w:type="dxa"/>
+          <w:bottom w:w="95" w:type="dxa"/>
+          <w:left w:w="110" w:type="dxa"/>
+          <w:right w:w="110" w:type="dxa"/>
+        </w:tblCellMar>
+      </w:tblPr>
+      <w:tblGrid>
+        <w:gridCol w:w="792"/>
+        <w:gridCol w:w="1152"/>
+        <w:gridCol w:w="3960"/>
+        <w:gridCol w:w="3960"/>
+      </w:tblGrid>
+      <w:tr>
+        <w:trPr>
+          <w:tblHeader/>
+          <w:cantSplit/>
+        </w:trPr>
+        <w:tc>
+          <w:tcPr>
+            <w:tcW w:type="dxa" w:w="792"/>
+            <w:vAlign w:val="center"/>
+            <w:shd w:fill="233E59"/>
+          </w:tcPr>
+          <w:p>
+            <w:pPr>
+              <w:spacing w:before="20" w:after="40" w:line="283" w:lineRule="auto"/>
+              <w:jc w:val="center"/>
+            </w:pPr>
+            <w:r>
+              <w:rPr>
+                <w:b/>
+                <w:color w:val="FFFFFF"/>
+                <w:sz w:val="21"/>
+              </w:rPr>
+              <w:t>力</w:t>
+            </w:r>
+          </w:p>
+        </w:tc>
+        <w:tc>
+          <w:tcPr>
+            <w:tcW w:type="dxa" w:w="1152"/>
+            <w:vAlign w:val="center"/>
+            <w:shd w:fill="233E59"/>
+          </w:tcPr>
+          <w:p>
+            <w:pPr>
+              <w:spacing w:before="20" w:after="40" w:line="283" w:lineRule="auto"/>
+              <w:jc w:val="center"/>
+            </w:pPr>
+            <w:r>
+              <w:rPr>
+                <w:b/>
+                <w:color w:val="FFFFFF"/>
+                <w:sz w:val="21"/>
+              </w:rPr>
+              <w:t>大小 N</w:t>
+            </w:r>
+          </w:p>
+        </w:tc>
+        <w:tc>
+          <w:tcPr>
+            <w:tcW w:type="dxa" w:w="3960"/>
+            <w:vAlign w:val="center"/>
+            <w:shd w:fill="233E59"/>
+          </w:tcPr>
+          <w:p>
+            <w:pPr>
+              <w:spacing w:before="20" w:after="40" w:line="283" w:lineRule="auto"/>
+              <w:jc w:val="center"/>
+            </w:pPr>
+            <w:r>
+              <w:rPr>
+                <w:b/>
+                <w:color w:val="FFFFFF"/>
+                <w:sz w:val="21"/>
+              </w:rPr>
+              <w:t>力分量 N</w:t>
+            </w:r>
+          </w:p>
+        </w:tc>
+        <w:tc>
+          <w:tcPr>
+            <w:tcW w:type="dxa" w:w="3960"/>
+            <w:vAlign w:val="center"/>
+            <w:shd w:fill="233E59"/>
+          </w:tcPr>
+          <w:p>
+            <w:pPr>
+              <w:spacing w:before="20" w:after="40" w:line="283" w:lineRule="auto"/>
+              <w:jc w:val="center"/>
+            </w:pPr>
+            <w:r>
+              <w:rPr>
+                <w:b/>
+                <w:color w:val="FFFFFF"/>
+                <w:sz w:val="21"/>
+              </w:rPr>
+              <w:t>作用点 m</w:t>
+            </w:r>
+          </w:p>
+        </w:tc>
+      </w:tr>
+      <w:tr>
+        <w:trPr>
+          <w:cantSplit/>
+        </w:trPr>
+        <w:tc>
+          <w:tcPr>
+            <w:tcW w:type="dxa" w:w="792"/>
+            <w:vAlign w:val="center"/>
+            <w:shd w:fill="FFFFFF"/>
+          </w:tcPr>
+          <w:p>
+            <w:pPr>
+              <w:spacing w:before="20" w:after="40" w:line="283" w:lineRule="auto"/>
+              <w:jc w:val="center"/>
+            </w:pPr>
+            <w:r>
+              <w:rPr>
+                <w:b w:val="0"/>
+                <w:color w:val="000000"/>
+                <w:sz w:val="21"/>
+              </w:rPr>
+              <w:t>F1</w:t>
+            </w:r>
+          </w:p>
+        </w:tc>
+        <w:tc>
+          <w:tcPr>
+            <w:tcW w:type="dxa" w:w="1152"/>
+            <w:vAlign w:val="center"/>
+            <w:shd w:fill="FFFFFF"/>
+          </w:tcPr>
+          <w:p>
+            <w:pPr>
+              <w:spacing w:before="20" w:after="40" w:line="283" w:lineRule="auto"/>
+              <w:jc w:val="center"/>
+            </w:pPr>
+            <w:r>
+              <w:rPr>
+                <w:b w:val="0"/>
+                <w:color w:val="000000"/>
+                <w:sz w:val="21"/>
+              </w:rPr>
+              <w:t>1</w:t>
+            </w:r>
+          </w:p>
+        </w:tc>
+        <w:tc>
+          <w:tcPr>
+            <w:tcW w:type="dxa" w:w="3960"/>
+            <w:vAlign w:val="center"/>
+            <w:shd w:fill="FFFFFF"/>
+          </w:tcPr>
+          <w:p>
+            <w:pPr>
+              <w:spacing w:before="20" w:after="40" w:line="283" w:lineRule="auto"/>
+              <w:jc w:val="center"/>
+            </w:pPr>
+            <w:r>
+              <w:rPr>
+                <w:b w:val="0"/>
+                <w:color w:val="000000"/>
+                <w:sz w:val="21"/>
+              </w:rPr>
+              <w:t>(0, 0, 1)</w:t>
+            </w:r>
+          </w:p>
+        </w:tc>
+        <w:tc>
+          <w:tcPr>
+            <w:tcW w:type="dxa" w:w="3960"/>
+            <w:vAlign w:val="center"/>
+            <w:shd w:fill="FFFFFF"/>
+          </w:tcPr>
+          <w:p>
+            <w:pPr>
+              <w:spacing w:before="20" w:after="40" w:line="283" w:lineRule="auto"/>
+              <w:jc w:val="center"/>
+            </w:pPr>
+            <w:r>
+              <w:rPr>
+                <w:b w:val="0"/>
+                <w:color w:val="000000"/>
+                <w:sz w:val="21"/>
+              </w:rPr>
+              <w:t>(1, 0, 0)</w:t>
+            </w:r>
+          </w:p>
+        </w:tc>
+      </w:tr>
+      <w:tr>
+        <w:trPr>
+          <w:cantSplit/>
+        </w:trPr>
+        <w:tc>
+          <w:tcPr>
+            <w:tcW w:type="dxa" w:w="792"/>
+            <w:vAlign w:val="center"/>
+            <w:shd w:fill="F5F8FB"/>
+          </w:tcPr>
+          <w:p>
+            <w:pPr>
+              <w:spacing w:before="20" w:after="40" w:line="283" w:lineRule="auto"/>
+              <w:jc w:val="center"/>
+            </w:pPr>
+            <w:r>
+              <w:rPr>
+                <w:b w:val="0"/>
+                <w:color w:val="000000"/>
+                <w:sz w:val="21"/>
+              </w:rPr>
+              <w:t>F2</w:t>
+            </w:r>
+          </w:p>
+        </w:tc>
+        <w:tc>
+          <w:tcPr>
+            <w:tcW w:type="dxa" w:w="1152"/>
+            <w:vAlign w:val="center"/>
+            <w:shd w:fill="F5F8FB"/>
+          </w:tcPr>
+          <w:p>
+            <w:pPr>
+              <w:spacing w:before="20" w:after="40" w:line="283" w:lineRule="auto"/>
+              <w:jc w:val="center"/>
+            </w:pPr>
+            <w:r>
+              <w:rPr>
+                <w:b w:val="0"/>
+                <w:color w:val="000000"/>
+                <w:sz w:val="21"/>
+              </w:rPr>
+              <w:t>√2</w:t>
+            </w:r>
+          </w:p>
+        </w:tc>
+        <w:tc>
+          <w:tcPr>
+            <w:tcW w:type="dxa" w:w="3960"/>
+            <w:vAlign w:val="center"/>
+            <w:shd w:fill="F5F8FB"/>
+          </w:tcPr>
+          <w:p>
+            <w:pPr>
+              <w:spacing w:before="20" w:after="40" w:line="283" w:lineRule="auto"/>
+              <w:jc w:val="center"/>
+            </w:pPr>
+            <w:r>
+              <w:rPr>
+                <w:b w:val="0"/>
+                <w:color w:val="000000"/>
+                <w:sz w:val="21"/>
+              </w:rPr>
+              <w:t>(0, −1, 1)</w:t>
+            </w:r>
+          </w:p>
+        </w:tc>
+        <w:tc>
+          <w:tcPr>
+            <w:tcW w:type="dxa" w:w="3960"/>
+            <w:vAlign w:val="center"/>
+            <w:shd w:fill="F5F8FB"/>
+          </w:tcPr>
+          <w:p>
+            <w:pPr>
+              <w:spacing w:before="20" w:after="40" w:line="283" w:lineRule="auto"/>
+              <w:jc w:val="center"/>
+            </w:pPr>
+            <w:r>
+              <w:rPr>
+                <w:b w:val="0"/>
+                <w:color w:val="000000"/>
+                <w:sz w:val="21"/>
+              </w:rPr>
+              <w:t>(1, 1, 0)</w:t>
+            </w:r>
+          </w:p>
+        </w:tc>
+      </w:tr>
+      <w:tr>
+        <w:trPr>
+          <w:cantSplit/>
+        </w:trPr>
+        <w:tc>
+          <w:tcPr>
+            <w:tcW w:type="dxa" w:w="792"/>
+            <w:vAlign w:val="center"/>
+            <w:shd w:fill="FFFFFF"/>
+          </w:tcPr>
+          <w:p>
+            <w:pPr>
+              <w:spacing w:before="20" w:after="40" w:line="283" w:lineRule="auto"/>
+              <w:jc w:val="center"/>
+            </w:pPr>
+            <w:r>
+              <w:rPr>
+                <w:b w:val="0"/>
+                <w:color w:val="000000"/>
+                <w:sz w:val="21"/>
+              </w:rPr>
+              <w:t>F3</w:t>
+            </w:r>
+          </w:p>
+        </w:tc>
+        <w:tc>
+          <w:tcPr>
+            <w:tcW w:type="dxa" w:w="1152"/>
+            <w:vAlign w:val="center"/>
+            <w:shd w:fill="FFFFFF"/>
+          </w:tcPr>
+          <w:p>
+            <w:pPr>
+              <w:spacing w:before="20" w:after="40" w:line="283" w:lineRule="auto"/>
+              <w:jc w:val="center"/>
+            </w:pPr>
+            <w:r>
+              <w:rPr>
+                <w:b w:val="0"/>
+                <w:color w:val="000000"/>
+                <w:sz w:val="21"/>
+              </w:rPr>
+              <w:t>1</w:t>
+            </w:r>
+          </w:p>
+        </w:tc>
+        <w:tc>
+          <w:tcPr>
+            <w:tcW w:type="dxa" w:w="3960"/>
+            <w:vAlign w:val="center"/>
+            <w:shd w:fill="FFFFFF"/>
+          </w:tcPr>
+          <w:p>
+            <w:pPr>
+              <w:spacing w:before="20" w:after="40" w:line="283" w:lineRule="auto"/>
+              <w:jc w:val="center"/>
+            </w:pPr>
+            <w:r>
+              <w:rPr>
+                <w:b w:val="0"/>
+                <w:color w:val="000000"/>
+                <w:sz w:val="21"/>
+              </w:rPr>
+              <w:t>(0, −1, 0)</w:t>
+            </w:r>
+          </w:p>
+        </w:tc>
+        <w:tc>
+          <w:tcPr>
+            <w:tcW w:type="dxa" w:w="3960"/>
+            <w:vAlign w:val="center"/>
+            <w:shd w:fill="FFFFFF"/>
+          </w:tcPr>
+          <w:p>
+            <w:pPr>
+              <w:spacing w:before="20" w:after="40" w:line="283" w:lineRule="auto"/>
+              <w:jc w:val="center"/>
+            </w:pPr>
+            <w:r>
+              <w:rPr>
+                <w:b w:val="0"/>
+                <w:color w:val="000000"/>
+                <w:sz w:val="21"/>
+              </w:rPr>
+              <w:t>(0, 1, 0)</w:t>
+            </w:r>
+          </w:p>
+        </w:tc>
+      </w:tr>
+      <w:tr>
+        <w:trPr>
+          <w:cantSplit/>
+        </w:trPr>
+        <w:tc>
+          <w:tcPr>
+            <w:tcW w:type="dxa" w:w="792"/>
+            <w:vAlign w:val="center"/>
+            <w:shd w:fill="F5F8FB"/>
+          </w:tcPr>
+          <w:p>
+            <w:pPr>
+              <w:spacing w:before="20" w:after="40" w:line="283" w:lineRule="auto"/>
+              <w:jc w:val="center"/>
+            </w:pPr>
+            <w:r>
+              <w:rPr>
+                <w:b w:val="0"/>
+                <w:color w:val="000000"/>
+                <w:sz w:val="21"/>
+              </w:rPr>
+              <w:t>F4</w:t>
+            </w:r>
+          </w:p>
+        </w:tc>
+        <w:tc>
+          <w:tcPr>
+            <w:tcW w:type="dxa" w:w="1152"/>
+            <w:vAlign w:val="center"/>
+            <w:shd w:fill="F5F8FB"/>
+          </w:tcPr>
+          <w:p>
+            <w:pPr>
+              <w:spacing w:before="20" w:after="40" w:line="283" w:lineRule="auto"/>
+              <w:jc w:val="center"/>
+            </w:pPr>
+            <w:r>
+              <w:rPr>
+                <w:b w:val="0"/>
+                <w:color w:val="000000"/>
+                <w:sz w:val="21"/>
+              </w:rPr>
+              <w:t>√2</w:t>
+            </w:r>
+          </w:p>
+        </w:tc>
+        <w:tc>
+          <w:tcPr>
+            <w:tcW w:type="dxa" w:w="3960"/>
+            <w:vAlign w:val="center"/>
+            <w:shd w:fill="F5F8FB"/>
+          </w:tcPr>
+          <w:p>
+            <w:pPr>
+              <w:spacing w:before="20" w:after="40" w:line="283" w:lineRule="auto"/>
+              <w:jc w:val="center"/>
+            </w:pPr>
+            <w:r>
+              <w:rPr>
+                <w:b w:val="0"/>
+                <w:color w:val="000000"/>
+                <w:sz w:val="21"/>
+              </w:rPr>
+              <w:t>(1, 1, 0)</w:t>
+            </w:r>
+          </w:p>
+        </w:tc>
+        <w:tc>
+          <w:tcPr>
+            <w:tcW w:type="dxa" w:w="3960"/>
+            <w:vAlign w:val="center"/>
+            <w:shd w:fill="F5F8FB"/>
+          </w:tcPr>
+          <w:p>
+            <w:pPr>
+              <w:spacing w:before="20" w:after="40" w:line="283" w:lineRule="auto"/>
+              <w:jc w:val="center"/>
+            </w:pPr>
+            <w:r>
+              <w:rPr>
+                <w:b w:val="0"/>
+                <w:color w:val="000000"/>
+                <w:sz w:val="21"/>
+              </w:rPr>
+              <w:t>(0, 0, 1)</w:t>
+            </w:r>
+          </w:p>
+        </w:tc>
+      </w:tr>
+    </w:tbl>
+    <w:p>
+      <w:pPr>
+        <w:spacing w:before="0" w:after="80" w:line="20" w:lineRule="exact"/>
+      </w:pPr>
+      <w:r>
+        <w:rPr>
+          <w:sz w:val="2"/>
+        </w:rPr>
+      </w:r>
+    </w:p>
+    <w:p>
+      <w:pPr>
+        <w:widowControl/>
+        <w:spacing w:after="120"/>
+      </w:pPr>
+      <w:r>
+        <w:rPr>
+          <w:b w:val="0"/>
+        </w:rPr>
+        <w:t>F1 沿 +Z，F3 沿 −Y 且其作用线经过 O。F2 在前表面内，从 (1,1,0) 指向 (1,0,1)；F4 在顶面内，从 (0,0,1) 指向 (1,1,1)。两条面对角线的方向向量长度均为 √2，因此大小为 √2 N 时，两个非零力分量各为 1 N，符号按箭头方向确定。</w:t>
+      </w:r>
+    </w:p>
+    <w:p>
+      <w:pPr>
+        <w:pStyle w:val="Heading1"/>
+        <w:pageBreakBefore/>
+      </w:pPr>
+      <w:r>
+        <w:t>正方体例题的计算与最简结果</w:t>
+      </w:r>
+    </w:p>
+    <w:p>
+      <w:pPr>
+        <w:pStyle w:val="Heading2"/>
+      </w:pPr>
+      <w:r>
+        <w:t>向 O 点简化</w:t>
+      </w:r>
+    </w:p>
+    <w:p>
+      <w:pPr>
+        <w:widowControl/>
+        <w:spacing w:after="120"/>
+      </w:pPr>
+      <w:r>
+        <w:rPr>
+          <w:b w:val="0"/>
+        </w:rPr>
+        <w:t>无附加自由力偶。按各力的作用点与分量求叉积，各力对 O 点的矩如下。</w:t>
+      </w:r>
+    </w:p>
+    <w:tbl>
+      <w:tblPr>
+        <w:tblW w:type="auto" w:w="0"/>
+        <w:jc w:val="center"/>
+        <w:tblLayout w:type="fixed"/>
+        <w:tblLook w:firstColumn="1" w:firstRow="1" w:lastColumn="0" w:lastRow="0" w:noHBand="0" w:noVBand="1" w:val="04A0"/>
+        <w:tblBorders>
+          <w:top w:val="single" w:sz="4" w:color="D9D9D9"/>
+          <w:left w:val="single" w:sz="4" w:color="D9D9D9"/>
+          <w:bottom w:val="single" w:sz="4" w:color="D9D9D9"/>
+          <w:right w:val="single" w:sz="4" w:color="D9D9D9"/>
+          <w:insideH w:val="single" w:sz="4" w:color="D9D9D9"/>
+          <w:insideV w:val="single" w:sz="4" w:color="D9D9D9"/>
+        </w:tblBorders>
+        <w:tblCellMar>
+          <w:top w:w="95" w:type="dxa"/>
+          <w:bottom w:w="95" w:type="dxa"/>
+          <w:left w:w="110" w:type="dxa"/>
+          <w:right w:w="110" w:type="dxa"/>
+        </w:tblCellMar>
+      </w:tblPr>
+      <w:tblGrid>
+        <w:gridCol w:w="1440"/>
+        <w:gridCol w:w="8424"/>
+      </w:tblGrid>
+      <w:tr>
+        <w:trPr>
+          <w:tblHeader/>
+          <w:cantSplit/>
+        </w:trPr>
+        <w:tc>
+          <w:tcPr>
+            <w:tcW w:type="dxa" w:w="1440"/>
+            <w:vAlign w:val="center"/>
+            <w:shd w:fill="233E59"/>
+          </w:tcPr>
+          <w:p>
+            <w:pPr>
+              <w:spacing w:before="20" w:after="40" w:line="283" w:lineRule="auto"/>
+              <w:jc w:val="center"/>
+            </w:pPr>
+            <w:r>
+              <w:rPr>
+                <w:b/>
+                <w:color w:val="FFFFFF"/>
+                <w:sz w:val="21"/>
+              </w:rPr>
+              <w:t>力</w:t>
+            </w:r>
+          </w:p>
+        </w:tc>
+        <w:tc>
+          <w:tcPr>
+            <w:tcW w:type="dxa" w:w="8424"/>
+            <w:vAlign w:val="center"/>
+            <w:shd w:fill="233E59"/>
+          </w:tcPr>
+          <w:p>
+            <w:pPr>
+              <w:spacing w:before="20" w:after="40" w:line="283" w:lineRule="auto"/>
+              <w:jc w:val="center"/>
+            </w:pPr>
+            <w:r>
+              <w:rPr>
+                <w:b/>
+                <w:color w:val="FFFFFF"/>
+                <w:sz w:val="21"/>
+              </w:rPr>
+              <w:t>对 O 点的矩 N·m</w:t>
+            </w:r>
+          </w:p>
+        </w:tc>
+      </w:tr>
+      <w:tr>
+        <w:trPr>
+          <w:cantSplit/>
+        </w:trPr>
+        <w:tc>
+          <w:tcPr>
+            <w:tcW w:type="dxa" w:w="1440"/>
+            <w:vAlign w:val="center"/>
+            <w:shd w:fill="FFFFFF"/>
+          </w:tcPr>
+          <w:p>
+            <w:pPr>
+              <w:spacing w:before="20" w:after="40" w:line="283" w:lineRule="auto"/>
+              <w:jc w:val="center"/>
+            </w:pPr>
+            <w:r>
+              <w:rPr>
+                <w:b w:val="0"/>
+                <w:color w:val="000000"/>
+                <w:sz w:val="21"/>
+              </w:rPr>
+              <w:t>F1</w:t>
+            </w:r>
+          </w:p>
+        </w:tc>
+        <w:tc>
+          <w:tcPr>
+            <w:tcW w:type="dxa" w:w="8424"/>
+            <w:vAlign w:val="center"/>
+            <w:shd w:fill="FFFFFF"/>
+          </w:tcPr>
+          <w:p>
+            <w:pPr>
+              <w:spacing w:before="20" w:after="40" w:line="283" w:lineRule="auto"/>
+              <w:jc w:val="center"/>
+            </w:pPr>
+            <w:r>
+              <w:rPr>
+                <w:b w:val="0"/>
+                <w:color w:val="000000"/>
+                <w:sz w:val="21"/>
+              </w:rPr>
+              <w:t>(0, −1, 0)</w:t>
+            </w:r>
+          </w:p>
+        </w:tc>
+      </w:tr>
+      <w:tr>
+        <w:trPr>
+          <w:cantSplit/>
+        </w:trPr>
+        <w:tc>
+          <w:tcPr>
+            <w:tcW w:type="dxa" w:w="1440"/>
+            <w:vAlign w:val="center"/>
+            <w:shd w:fill="F5F8FB"/>
+          </w:tcPr>
+          <w:p>
+            <w:pPr>
+              <w:spacing w:before="20" w:after="40" w:line="283" w:lineRule="auto"/>
+              <w:jc w:val="center"/>
+            </w:pPr>
+            <w:r>
+              <w:rPr>
+                <w:b w:val="0"/>
+                <w:color w:val="000000"/>
+                <w:sz w:val="21"/>
+              </w:rPr>
+              <w:t>F2</w:t>
+            </w:r>
+          </w:p>
+        </w:tc>
+        <w:tc>
+          <w:tcPr>
+            <w:tcW w:type="dxa" w:w="8424"/>
+            <w:vAlign w:val="center"/>
+            <w:shd w:fill="F5F8FB"/>
+          </w:tcPr>
+          <w:p>
+            <w:pPr>
+              <w:spacing w:before="20" w:after="40" w:line="283" w:lineRule="auto"/>
+              <w:jc w:val="center"/>
+            </w:pPr>
+            <w:r>
+              <w:rPr>
+                <w:b w:val="0"/>
+                <w:color w:val="000000"/>
+                <w:sz w:val="21"/>
+              </w:rPr>
+              <w:t>(1, −1, −1)</w:t>
+            </w:r>
+          </w:p>
+        </w:tc>
+      </w:tr>
+      <w:tr>
+        <w:trPr>
+          <w:cantSplit/>
+        </w:trPr>
+        <w:tc>
+          <w:tcPr>
+            <w:tcW w:type="dxa" w:w="1440"/>
+            <w:vAlign w:val="center"/>
+            <w:shd w:fill="FFFFFF"/>
+          </w:tcPr>
+          <w:p>
+            <w:pPr>
+              <w:spacing w:before="20" w:after="40" w:line="283" w:lineRule="auto"/>
+              <w:jc w:val="center"/>
+            </w:pPr>
+            <w:r>
+              <w:rPr>
+                <w:b w:val="0"/>
+                <w:color w:val="000000"/>
+                <w:sz w:val="21"/>
+              </w:rPr>
+              <w:t>F3</w:t>
+            </w:r>
+          </w:p>
+        </w:tc>
+        <w:tc>
+          <w:tcPr>
+            <w:tcW w:type="dxa" w:w="8424"/>
+            <w:vAlign w:val="center"/>
+            <w:shd w:fill="FFFFFF"/>
+          </w:tcPr>
+          <w:p>
+            <w:pPr>
+              <w:spacing w:before="20" w:after="40" w:line="283" w:lineRule="auto"/>
+              <w:jc w:val="center"/>
+            </w:pPr>
+            <w:r>
+              <w:rPr>
+                <w:b w:val="0"/>
+                <w:color w:val="000000"/>
+                <w:sz w:val="21"/>
+              </w:rPr>
+              <w:t>(0, 0, 0)</w:t>
+            </w:r>
+          </w:p>
+        </w:tc>
+      </w:tr>
+      <w:tr>
+        <w:trPr>
+          <w:cantSplit/>
+        </w:trPr>
+        <w:tc>
+          <w:tcPr>
+            <w:tcW w:type="dxa" w:w="1440"/>
+            <w:vAlign w:val="center"/>
+            <w:shd w:fill="F5F8FB"/>
+          </w:tcPr>
+          <w:p>
+            <w:pPr>
+              <w:spacing w:before="20" w:after="40" w:line="283" w:lineRule="auto"/>
+              <w:jc w:val="center"/>
+            </w:pPr>
+            <w:r>
+              <w:rPr>
+                <w:b w:val="0"/>
+                <w:color w:val="000000"/>
+                <w:sz w:val="21"/>
+              </w:rPr>
+              <w:t>F4</w:t>
+            </w:r>
+          </w:p>
+        </w:tc>
+        <w:tc>
+          <w:tcPr>
+            <w:tcW w:type="dxa" w:w="8424"/>
+            <w:vAlign w:val="center"/>
+            <w:shd w:fill="F5F8FB"/>
+          </w:tcPr>
+          <w:p>
+            <w:pPr>
+              <w:spacing w:before="20" w:after="40" w:line="283" w:lineRule="auto"/>
+              <w:jc w:val="center"/>
+            </w:pPr>
+            <w:r>
+              <w:rPr>
+                <w:b w:val="0"/>
+                <w:color w:val="000000"/>
+                <w:sz w:val="21"/>
+              </w:rPr>
+              <w:t>(−1, 1, 0)</w:t>
+            </w:r>
+          </w:p>
+        </w:tc>
+      </w:tr>
+    </w:tbl>
+    <w:p>
+      <w:pPr>
+        <w:spacing w:before="0" w:after="80" w:line="20" w:lineRule="exact"/>
+      </w:pPr>
+      <w:r>
+        <w:rPr>
+          <w:sz w:val="2"/>
+        </w:rPr>
+      </w:r>
+    </w:p>
+    <w:p>
+      <w:pPr>
+        <w:keepLines/>
+        <w:spacing w:before="40" w:after="80" w:line="269" w:lineRule="auto"/>
+        <w:jc w:val="center"/>
+      </w:pPr>
+      <m:oMathPara>
+        <m:oMathParaPr>
+          <m:jc m:val="center"/>
+        </m:oMathParaPr>
+        <m:oMath>
+          <m:r>
+            <m:rPr>
+              <m:sty m:val="b"/>
+            </m:rPr>
+            <m:t>R</m:t>
+          </m:r>
+          <m:r>
+            <m:rPr/>
+            <m:t> = </m:t>
+          </m:r>
+          <m:sSub>
+            <m:e>
+              <m:r>
+                <m:rPr>
+                  <m:sty m:val="b"/>
+                </m:rPr>
+                <m:t>F</m:t>
+              </m:r>
+            </m:e>
+            <m:sub>
+              <m:r>
+                <m:rPr/>
+                <m:t>1</m:t>
+              </m:r>
+            </m:sub>
+          </m:sSub>
+          <m:r>
+            <m:rPr/>
+            <m:t> + </m:t>
+          </m:r>
+          <m:sSub>
+            <m:e>
+              <m:r>
+                <m:rPr>
+                  <m:sty m:val="b"/>
+                </m:rPr>
+                <m:t>F</m:t>
+              </m:r>
+            </m:e>
+            <m:sub>
+              <m:r>
+                <m:rPr/>
+                <m:t>2</m:t>
+              </m:r>
+            </m:sub>
+          </m:sSub>
+          <m:r>
+            <m:rPr/>
+            <m:t> + </m:t>
+          </m:r>
+          <m:sSub>
+            <m:e>
+              <m:r>
+                <m:rPr>
+                  <m:sty m:val="b"/>
+                </m:rPr>
+                <m:t>F</m:t>
+              </m:r>
+            </m:e>
+            <m:sub>
+              <m:r>
+                <m:rPr/>
+                <m:t>3</m:t>
+              </m:r>
+            </m:sub>
+          </m:sSub>
+          <m:r>
+            <m:rPr/>
+            <m:t> + </m:t>
+          </m:r>
+          <m:sSub>
+            <m:e>
+              <m:r>
+                <m:rPr>
+                  <m:sty m:val="b"/>
+                </m:rPr>
+                <m:t>F</m:t>
+              </m:r>
+            </m:e>
+            <m:sub>
+              <m:r>
+                <m:rPr/>
+                <m:t>4</m:t>
+              </m:r>
+            </m:sub>
+          </m:sSub>
+          <m:r>
+            <m:rPr/>
+            <m:t> = (1, −1, 2)</m:t>
+          </m:r>
+          <m:r>
+            <m:rPr>
+              <m:nor/>
+            </m:rPr>
+            <m:t> N</m:t>
+          </m:r>
+        </m:oMath>
+      </m:oMathPara>
+    </w:p>
+    <w:p>
+      <w:pPr>
+        <w:keepLines/>
+        <w:spacing w:before="40" w:after="80" w:line="269" w:lineRule="auto"/>
+        <w:jc w:val="center"/>
+      </w:pPr>
+      <m:oMathPara>
+        <m:oMathParaPr>
+          <m:jc m:val="center"/>
+        </m:oMathParaPr>
+        <m:oMath>
+          <m:sSub>
+            <m:e>
+              <m:r>
+                <m:rPr>
+                  <m:sty m:val="b"/>
+                </m:rPr>
+                <m:t>M</m:t>
+              </m:r>
+            </m:e>
+            <m:sub>
+              <m:r>
+                <m:rPr/>
+                <m:t>O</m:t>
+              </m:r>
+            </m:sub>
+          </m:sSub>
+          <m:r>
+            <m:rPr/>
+            <m:t> = (0, −1, −1)</m:t>
+          </m:r>
+          <m:r>
+            <m:rPr>
+              <m:nor/>
+            </m:rPr>
+            <m:t> N·m</m:t>
+          </m:r>
+        </m:oMath>
+      </m:oMathPara>
+    </w:p>
+    <w:tbl>
+      <w:tblPr>
+        <w:tblW w:type="auto" w:w="0"/>
+        <w:jc w:val="center"/>
+        <w:tblLayout w:type="fixed"/>
+        <w:tblLook w:firstColumn="1" w:firstRow="1" w:lastColumn="0" w:lastRow="0" w:noHBand="0" w:noVBand="1" w:val="04A0"/>
+        <w:tblBorders>
+          <w:top w:val="single" w:sz="4" w:color="D9D9D9"/>
+          <w:left w:val="single" w:sz="4" w:color="D9D9D9"/>
+          <w:bottom w:val="single" w:sz="4" w:color="D9D9D9"/>
+          <w:right w:val="single" w:sz="4" w:color="D9D9D9"/>
+          <w:insideH w:val="single" w:sz="4" w:color="D9D9D9"/>
+          <w:insideV w:val="single" w:sz="4" w:color="D9D9D9"/>
+        </w:tblBorders>
+        <w:tblCellMar>
+          <w:top w:w="95" w:type="dxa"/>
+          <w:bottom w:w="95" w:type="dxa"/>
+          <w:left w:w="110" w:type="dxa"/>
+          <w:right w:w="110" w:type="dxa"/>
+        </w:tblCellMar>
+      </w:tblPr>
+      <w:tblGrid>
+        <w:gridCol w:w="1440"/>
+        <w:gridCol w:w="4212"/>
+        <w:gridCol w:w="4212"/>
+      </w:tblGrid>
+      <w:tr>
+        <w:trPr>
+          <w:tblHeader/>
+          <w:cantSplit/>
+        </w:trPr>
+        <w:tc>
+          <w:tcPr>
+            <w:tcW w:type="dxa" w:w="1440"/>
+            <w:vAlign w:val="center"/>
+            <w:shd w:fill="233E59"/>
+          </w:tcPr>
+          <w:p>
+            <w:pPr>
+              <w:spacing w:before="20" w:after="40" w:line="283" w:lineRule="auto"/>
+              <w:jc w:val="center"/>
+            </w:pPr>
+            <w:r>
+              <w:rPr>
+                <w:b/>
+                <w:color w:val="FFFFFF"/>
+                <w:sz w:val="21"/>
+              </w:rPr>
+              <w:t>输出量</w:t>
+            </w:r>
+          </w:p>
+        </w:tc>
+        <w:tc>
+          <w:tcPr>
+            <w:tcW w:type="dxa" w:w="4212"/>
+            <w:vAlign w:val="center"/>
+            <w:shd w:fill="233E59"/>
+          </w:tcPr>
+          <w:p>
+            <w:pPr>
+              <w:spacing w:before="20" w:after="40" w:line="283" w:lineRule="auto"/>
+              <w:jc w:val="center"/>
+            </w:pPr>
+            <w:r>
+              <w:rPr>
+                <w:b/>
+                <w:color w:val="FFFFFF"/>
+                <w:sz w:val="21"/>
+              </w:rPr>
+              <w:t>主矢 R</w:t>
+            </w:r>
+          </w:p>
+        </w:tc>
+        <w:tc>
+          <w:tcPr>
+            <w:tcW w:type="dxa" w:w="4212"/>
+            <w:vAlign w:val="center"/>
+            <w:shd w:fill="233E59"/>
+          </w:tcPr>
+          <w:p>
+            <w:pPr>
+              <w:spacing w:before="20" w:after="40" w:line="283" w:lineRule="auto"/>
+              <w:jc w:val="center"/>
+            </w:pPr>
+            <w:r>
+              <w:rPr>
+                <w:b/>
+                <w:color w:val="FFFFFF"/>
+                <w:sz w:val="21"/>
+              </w:rPr>
+              <w:t>主矩 MO</w:t>
+            </w:r>
+          </w:p>
+        </w:tc>
+      </w:tr>
+      <w:tr>
+        <w:trPr>
+          <w:cantSplit/>
+        </w:trPr>
+        <w:tc>
+          <w:tcPr>
+            <w:tcW w:type="dxa" w:w="1440"/>
+            <w:vAlign w:val="center"/>
+            <w:shd w:fill="FFFFFF"/>
+          </w:tcPr>
+          <w:p>
+            <w:pPr>
+              <w:spacing w:before="20" w:after="40" w:line="283" w:lineRule="auto"/>
+              <w:jc w:val="center"/>
+            </w:pPr>
+            <w:r>
+              <w:rPr>
+                <w:b w:val="0"/>
+                <w:color w:val="000000"/>
+                <w:sz w:val="21"/>
+              </w:rPr>
+              <w:t>大小</w:t>
+            </w:r>
+          </w:p>
+        </w:tc>
+        <w:tc>
+          <w:tcPr>
+            <w:tcW w:type="dxa" w:w="4212"/>
+            <w:vAlign w:val="center"/>
+            <w:shd w:fill="FFFFFF"/>
+          </w:tcPr>
+          <w:p>
+            <w:pPr>
+              <w:spacing w:before="20" w:after="40" w:line="283" w:lineRule="auto"/>
+              <w:jc w:val="center"/>
+            </w:pPr>
+            <w:r>
+              <w:rPr>
+                <w:b w:val="0"/>
+                <w:color w:val="000000"/>
+                <w:sz w:val="21"/>
+              </w:rPr>
+              <w:t>√6 ≈ 2.449490 N</w:t>
+            </w:r>
+          </w:p>
+        </w:tc>
+        <w:tc>
+          <w:tcPr>
+            <w:tcW w:type="dxa" w:w="4212"/>
+            <w:vAlign w:val="center"/>
+            <w:shd w:fill="FFFFFF"/>
+          </w:tcPr>
+          <w:p>
+            <w:pPr>
+              <w:spacing w:before="20" w:after="40" w:line="283" w:lineRule="auto"/>
+              <w:jc w:val="center"/>
+            </w:pPr>
+            <w:r>
+              <w:rPr>
+                <w:b w:val="0"/>
+                <w:color w:val="000000"/>
+                <w:sz w:val="21"/>
+              </w:rPr>
+              <w:t>√2 ≈ 1.414214 N·m</w:t>
+            </w:r>
+          </w:p>
+        </w:tc>
+      </w:tr>
+      <w:tr>
+        <w:trPr>
+          <w:cantSplit/>
+        </w:trPr>
+        <w:tc>
+          <w:tcPr>
+            <w:tcW w:type="dxa" w:w="1440"/>
+            <w:vAlign w:val="center"/>
+            <w:shd w:fill="F5F8FB"/>
+          </w:tcPr>
+          <w:p>
+            <w:pPr>
+              <w:spacing w:before="20" w:after="40" w:line="283" w:lineRule="auto"/>
+              <w:jc w:val="center"/>
+            </w:pPr>
+            <w:r>
+              <w:rPr>
+                <w:b w:val="0"/>
+                <w:color w:val="000000"/>
+                <w:sz w:val="21"/>
+              </w:rPr>
+              <w:t>单位方向</w:t>
+            </w:r>
+          </w:p>
+        </w:tc>
+        <w:tc>
+          <w:tcPr>
+            <w:tcW w:type="dxa" w:w="4212"/>
+            <w:vAlign w:val="center"/>
+            <w:shd w:fill="F5F8FB"/>
+          </w:tcPr>
+          <w:p>
+            <w:pPr>
+              <w:spacing w:before="20" w:after="40" w:line="283" w:lineRule="auto"/>
+              <w:jc w:val="left"/>
+            </w:pPr>
+            <w:r>
+              <w:rPr>
+                <w:b w:val="0"/>
+                <w:color w:val="000000"/>
+                <w:sz w:val="21"/>
+              </w:rPr>
+              <w:t>(0.408248, −0.408248, 0.816497)</w:t>
+            </w:r>
+          </w:p>
+        </w:tc>
+        <w:tc>
+          <w:tcPr>
+            <w:tcW w:type="dxa" w:w="4212"/>
+            <w:vAlign w:val="center"/>
+            <w:shd w:fill="F5F8FB"/>
+          </w:tcPr>
+          <w:p>
+            <w:pPr>
+              <w:spacing w:before="20" w:after="40" w:line="283" w:lineRule="auto"/>
+              <w:jc w:val="left"/>
+            </w:pPr>
+            <w:r>
+              <w:rPr>
+                <w:b w:val="0"/>
+                <w:color w:val="000000"/>
+                <w:sz w:val="21"/>
+              </w:rPr>
+              <w:t>(0, −0.707107, −0.707107)</w:t>
+            </w:r>
+          </w:p>
+        </w:tc>
+      </w:tr>
+      <w:tr>
+        <w:trPr>
+          <w:cantSplit/>
+        </w:trPr>
+        <w:tc>
+          <w:tcPr>
+            <w:tcW w:type="dxa" w:w="1440"/>
+            <w:vAlign w:val="center"/>
+            <w:shd w:fill="FFFFFF"/>
+          </w:tcPr>
+          <w:p>
+            <w:pPr>
+              <w:spacing w:before="20" w:after="40" w:line="283" w:lineRule="auto"/>
+              <w:jc w:val="center"/>
+            </w:pPr>
+            <w:r>
+              <w:rPr>
+                <w:b w:val="0"/>
+                <w:color w:val="000000"/>
+                <w:sz w:val="21"/>
+              </w:rPr>
+              <w:t>方向角 °</w:t>
+            </w:r>
+          </w:p>
+        </w:tc>
+        <w:tc>
+          <w:tcPr>
+            <w:tcW w:type="dxa" w:w="4212"/>
+            <w:vAlign w:val="center"/>
+            <w:shd w:fill="FFFFFF"/>
+          </w:tcPr>
+          <w:p>
+            <w:pPr>
+              <w:spacing w:before="20" w:after="40" w:line="283" w:lineRule="auto"/>
+              <w:jc w:val="left"/>
+            </w:pPr>
+            <w:r>
+              <w:rPr>
+                <w:b w:val="0"/>
+                <w:color w:val="000000"/>
+                <w:sz w:val="21"/>
+              </w:rPr>
+              <w:t>(65.905157, 114.094843, 35.264390)</w:t>
+            </w:r>
+          </w:p>
+        </w:tc>
+        <w:tc>
+          <w:tcPr>
+            <w:tcW w:type="dxa" w:w="4212"/>
+            <w:vAlign w:val="center"/>
+            <w:shd w:fill="FFFFFF"/>
+          </w:tcPr>
+          <w:p>
+            <w:pPr>
+              <w:spacing w:before="20" w:after="40" w:line="283" w:lineRule="auto"/>
+              <w:jc w:val="center"/>
+            </w:pPr>
+            <w:r>
+              <w:rPr>
+                <w:b w:val="0"/>
+                <w:color w:val="000000"/>
+                <w:sz w:val="21"/>
+              </w:rPr>
+              <w:t>(90, 135, 135)</w:t>
+            </w:r>
+          </w:p>
+        </w:tc>
+      </w:tr>
+    </w:tbl>
+    <w:p>
+      <w:pPr>
+        <w:spacing w:before="0" w:after="80" w:line="20" w:lineRule="exact"/>
+      </w:pPr>
+      <w:r>
+        <w:rPr>
+          <w:sz w:val="2"/>
+        </w:rPr>
+      </w:r>
+    </w:p>
+    <w:p>
+      <w:pPr>
+        <w:pStyle w:val="Heading2"/>
+      </w:pPr>
+      <w:r>
+        <w:t>最终简化为力螺旋</w:t>
+      </w:r>
+    </w:p>
+    <w:p>
+      <w:pPr>
+        <w:widowControl/>
+        <w:spacing w:after="120"/>
+      </w:pPr>
+      <w:r>
+        <w:rPr>
+          <w:b w:val="0"/>
+        </w:rPr>
+        <w:t>主矢非零，且 R·MO=−1 N²·m≠0，说明主矩沿主矢方向仍有不能通过移动合力消去的分量，最终结果为力螺旋。中心轴上一点 A 取为距 O 最近的点，得到：</w:t>
+      </w:r>
+    </w:p>
+    <w:p>
+      <w:pPr>
+        <w:keepLines/>
+        <w:spacing w:before="40" w:after="80" w:line="269" w:lineRule="auto"/>
+        <w:jc w:val="center"/>
+      </w:pPr>
+      <m:oMathPara>
+        <m:oMathParaPr>
+          <m:jc m:val="center"/>
+        </m:oMathParaPr>
+        <m:oMath>
+          <m:r>
+            <m:rPr>
+              <m:sty m:val="b"/>
+            </m:rPr>
+            <m:t>A</m:t>
+          </m:r>
+          <m:r>
+            <m:rPr/>
+            <m:t> = </m:t>
+          </m:r>
+          <m:f>
+            <m:num>
+              <m:r>
+                <m:rPr>
+                  <m:sty m:val="b"/>
+                </m:rPr>
+                <m:t>R</m:t>
+              </m:r>
+              <m:r>
+                <m:rPr/>
+                <m:t> × </m:t>
+              </m:r>
+              <m:sSub>
+                <m:e>
+                  <m:r>
+                    <m:rPr>
+                      <m:sty m:val="b"/>
+                    </m:rPr>
+                    <m:t>M</m:t>
+                  </m:r>
+                </m:e>
+                <m:sub>
+                  <m:r>
+                    <m:rPr/>
+                    <m:t>O</m:t>
+                  </m:r>
+                </m:sub>
+              </m:sSub>
+            </m:num>
+            <m:den>
+              <m:sSup>
+                <m:e>
+                  <m:d>
+                    <m:dPr>
+                      <m:begChr m:val="‖"/>
+                      <m:endChr m:val="‖"/>
+                    </m:dPr>
+                    <m:e>
+                      <m:r>
+                        <m:rPr>
+                          <m:sty m:val="b"/>
+                        </m:rPr>
+                        <m:t>R</m:t>
+                      </m:r>
+                    </m:e>
+                  </m:d>
+                </m:e>
+                <m:sup>
+                  <m:r>
+                    <m:rPr/>
+                    <m:t>2</m:t>
+                  </m:r>
+                </m:sup>
+              </m:sSup>
+            </m:den>
+          </m:f>
+          <m:r>
+            <m:rPr/>
+            <m:t> = </m:t>
+          </m:r>
+          <m:d>
+            <m:dPr>
+              <m:begChr m:val="("/>
+              <m:endChr m:val=")"/>
+            </m:dPr>
+            <m:e>
+              <m:f>
+                <m:num>
+                  <m:r>
+                    <m:rPr/>
+                    <m:t>1</m:t>
+                  </m:r>
+                </m:num>
+                <m:den>
+                  <m:r>
+                    <m:rPr/>
+                    <m:t>2</m:t>
+                  </m:r>
+                </m:den>
+              </m:f>
+              <m:r>
+                <m:rPr/>
+                <m:t>, </m:t>
+              </m:r>
+              <m:f>
+                <m:num>
+                  <m:r>
+                    <m:rPr/>
+                    <m:t>1</m:t>
+                  </m:r>
+                </m:num>
+                <m:den>
+                  <m:r>
+                    <m:rPr/>
+                    <m:t>6</m:t>
+                  </m:r>
+                </m:den>
+              </m:f>
+              <m:r>
+                <m:rPr/>
+                <m:t>, −</m:t>
+              </m:r>
+              <m:f>
+                <m:num>
+                  <m:r>
+                    <m:rPr/>
+                    <m:t>1</m:t>
+                  </m:r>
+                </m:num>
+                <m:den>
+                  <m:r>
+                    <m:rPr/>
+                    <m:t>6</m:t>
+                  </m:r>
+                </m:den>
+              </m:f>
+            </m:e>
+          </m:d>
+          <m:r>
+            <m:rPr>
+              <m:nor/>
+            </m:rPr>
+            <m:t> m</m:t>
+          </m:r>
+        </m:oMath>
+      </m:oMathPara>
+    </w:p>
+    <w:p>
+      <w:pPr>
+        <w:keepLines/>
+        <w:spacing w:before="40" w:after="80" w:line="269" w:lineRule="auto"/>
+        <w:jc w:val="center"/>
+      </w:pPr>
+      <m:oMathPara>
+        <m:oMathParaPr>
+          <m:jc m:val="center"/>
+        </m:oMathParaPr>
+        <m:oMath>
+          <m:r>
+            <m:rPr>
+              <m:sty m:val="b"/>
+            </m:rPr>
+            <m:t>u</m:t>
+          </m:r>
+          <m:r>
+            <m:rPr/>
+            <m:t> = </m:t>
+          </m:r>
+          <m:f>
+            <m:num>
+              <m:r>
+                <m:rPr/>
+                <m:t>1</m:t>
+              </m:r>
+            </m:num>
+            <m:den>
+              <m:rad>
+                <m:radPr>
+                  <m:degHide m:val="1"/>
+                </m:radPr>
+                <m:deg/>
+                <m:e>
+                  <m:r>
+                    <m:rPr/>
+                    <m:t>6</m:t>
+                  </m:r>
+                </m:e>
+              </m:rad>
+            </m:den>
+          </m:f>
+          <m:r>
+            <m:rPr/>
+            <m:t>(1, −1, 2)</m:t>
+          </m:r>
+        </m:oMath>
+      </m:oMathPara>
+    </w:p>
+    <w:p>
+      <w:pPr>
+        <w:keepLines/>
+        <w:spacing w:before="40" w:after="80" w:line="269" w:lineRule="auto"/>
+        <w:jc w:val="center"/>
+      </w:pPr>
+      <m:oMathPara>
+        <m:oMathParaPr>
+          <m:jc m:val="center"/>
+        </m:oMathParaPr>
+        <m:oMath>
+          <m:sSub>
+            <m:e>
+              <m:r>
+                <m:rPr>
+                  <m:sty m:val="b"/>
+                </m:rPr>
+                <m:t>M</m:t>
+              </m:r>
+            </m:e>
+            <m:sub>
+              <m:r>
+                <m:rPr/>
+                <m:t>∥</m:t>
+              </m:r>
+            </m:sub>
+          </m:sSub>
+          <m:r>
+            <m:rPr/>
+            <m:t> = </m:t>
+          </m:r>
+          <m:d>
+            <m:dPr>
+              <m:begChr m:val="("/>
+              <m:endChr m:val=")"/>
+            </m:dPr>
+            <m:e>
+              <m:r>
+                <m:rPr/>
+                <m:t>−</m:t>
+              </m:r>
+              <m:f>
+                <m:num>
+                  <m:r>
+                    <m:rPr/>
+                    <m:t>1</m:t>
+                  </m:r>
+                </m:num>
+                <m:den>
+                  <m:r>
+                    <m:rPr/>
+                    <m:t>6</m:t>
+                  </m:r>
+                </m:den>
+              </m:f>
+              <m:r>
+                <m:rPr>
+                  <m:nor/>
+                </m:rPr>
+                <m:t> m</m:t>
+              </m:r>
+            </m:e>
+          </m:d>
+          <m:r>
+            <m:rPr>
+              <m:sty m:val="b"/>
+            </m:rPr>
+            <m:t>R</m:t>
+          </m:r>
+          <m:r>
+            <m:rPr/>
+            <m:t> = </m:t>
+          </m:r>
+          <m:d>
+            <m:dPr>
+              <m:begChr m:val="("/>
+              <m:endChr m:val=")"/>
+            </m:dPr>
+            <m:e>
+              <m:r>
+                <m:rPr/>
+                <m:t>−</m:t>
+              </m:r>
+              <m:f>
+                <m:num>
+                  <m:r>
+                    <m:rPr/>
+                    <m:t>1</m:t>
+                  </m:r>
+                </m:num>
+                <m:den>
+                  <m:r>
+                    <m:rPr/>
+                    <m:t>6</m:t>
+                  </m:r>
+                </m:den>
+              </m:f>
+              <m:r>
+                <m:rPr/>
+                <m:t>, </m:t>
+              </m:r>
+              <m:f>
+                <m:num>
+                  <m:r>
+                    <m:rPr/>
+                    <m:t>1</m:t>
+                  </m:r>
+                </m:num>
+                <m:den>
+                  <m:r>
+                    <m:rPr/>
+                    <m:t>6</m:t>
+                  </m:r>
+                </m:den>
+              </m:f>
+              <m:r>
+                <m:rPr/>
+                <m:t>, −</m:t>
+              </m:r>
+              <m:f>
+                <m:num>
+                  <m:r>
+                    <m:rPr/>
+                    <m:t>1</m:t>
+                  </m:r>
+                </m:num>
+                <m:den>
+                  <m:r>
+                    <m:rPr/>
+                    <m:t>3</m:t>
+                  </m:r>
+                </m:den>
+              </m:f>
+            </m:e>
+          </m:d>
+          <m:r>
+            <m:rPr>
+              <m:nor/>
+            </m:rPr>
+            <m:t> N·m</m:t>
+          </m:r>
+        </m:oMath>
+      </m:oMathPara>
+    </w:p>
+    <w:p>
+      <w:pPr>
+        <w:keepLines/>
+        <w:spacing w:before="40" w:after="80" w:line="269" w:lineRule="auto"/>
+        <w:jc w:val="center"/>
+      </w:pPr>
+      <m:oMathPara>
+        <m:oMathParaPr>
+          <m:jc m:val="center"/>
+        </m:oMathParaPr>
+        <m:oMath>
+          <m:r>
+            <m:rPr/>
+            <m:t>h = −</m:t>
+          </m:r>
+          <m:f>
+            <m:num>
+              <m:r>
+                <m:rPr/>
+                <m:t>1</m:t>
+              </m:r>
+            </m:num>
+            <m:den>
+              <m:r>
+                <m:rPr/>
+                <m:t>6</m:t>
+              </m:r>
+            </m:den>
+          </m:f>
+          <m:r>
+            <m:rPr>
+              <m:nor/>
+            </m:rPr>
+            <m:t> m</m:t>
+          </m:r>
+          <m:r>
+            <m:rPr/>
+            <m:t> ≈ −0.166667</m:t>
+          </m:r>
+          <m:r>
+            <m:rPr>
+              <m:nor/>
+            </m:rPr>
+            <m:t> m</m:t>
+          </m:r>
+        </m:oMath>
+      </m:oMathPara>
+    </w:p>
+    <w:p>
+      <w:pPr>
+        <w:widowControl/>
+        <w:spacing w:after="120"/>
+      </w:pPr>
+      <w:r>
+        <w:rPr>
+          <w:b w:val="0"/>
+        </w:rPr>
+        <w:t>因此，最简结果是在下列中心轴上的合力 R=(1,−1,2) N，外加与合力反向的自由力偶 M∥，其大小为 1/√6≈0.408248 N·m。</w:t>
+      </w:r>
+    </w:p>
+    <w:p>
+      <w:pPr>
+        <w:keepLines/>
+        <w:spacing w:before="40" w:after="80" w:line="269" w:lineRule="auto"/>
+        <w:jc w:val="center"/>
+      </w:pPr>
+      <m:oMathPara>
+        <m:oMathParaPr>
+          <m:jc m:val="center"/>
+        </m:oMathParaPr>
+        <m:oMath>
+          <m:r>
+            <m:rPr>
+              <m:sty m:val="b"/>
+            </m:rPr>
+            <m:t>P</m:t>
+          </m:r>
+          <m:r>
+            <m:rPr/>
+            <m:t>(t) = </m:t>
+          </m:r>
+          <m:d>
+            <m:dPr>
+              <m:begChr m:val="("/>
+              <m:endChr m:val=")"/>
+            </m:dPr>
+            <m:e>
+              <m:f>
+                <m:num>
+                  <m:r>
+                    <m:rPr/>
+                    <m:t>1</m:t>
+                  </m:r>
+                </m:num>
+                <m:den>
+                  <m:r>
+                    <m:rPr/>
+                    <m:t>2</m:t>
+                  </m:r>
+                </m:den>
+              </m:f>
+              <m:r>
+                <m:rPr/>
+                <m:t>, </m:t>
+              </m:r>
+              <m:f>
+                <m:num>
+                  <m:r>
+                    <m:rPr/>
+                    <m:t>1</m:t>
+                  </m:r>
+                </m:num>
+                <m:den>
+                  <m:r>
+                    <m:rPr/>
+                    <m:t>6</m:t>
+                  </m:r>
+                </m:den>
+              </m:f>
+              <m:r>
+                <m:rPr/>
+                <m:t>, −</m:t>
+              </m:r>
+              <m:f>
+                <m:num>
+                  <m:r>
+                    <m:rPr/>
+                    <m:t>1</m:t>
+                  </m:r>
+                </m:num>
+                <m:den>
+                  <m:r>
+                    <m:rPr/>
+                    <m:t>6</m:t>
+                  </m:r>
+                </m:den>
+              </m:f>
+            </m:e>
+          </m:d>
+          <m:r>
+            <m:rPr/>
+            <m:t> + t </m:t>
+          </m:r>
+          <m:f>
+            <m:num>
+              <m:r>
+                <m:rPr/>
+                <m:t>1</m:t>
+              </m:r>
+            </m:num>
+            <m:den>
+              <m:rad>
+                <m:radPr>
+                  <m:degHide m:val="1"/>
+                </m:radPr>
+                <m:deg/>
+                <m:e>
+                  <m:r>
+                    <m:rPr/>
+                    <m:t>6</m:t>
+                  </m:r>
+                </m:e>
+              </m:rad>
+            </m:den>
+          </m:f>
+          <m:r>
+            <m:rPr/>
+            <m:t>(1, −1, 2),   t ∈ ℝ</m:t>
+          </m:r>
+        </m:oMath>
+      </m:oMathPara>
+    </w:p>
+    <w:p>
+      <w:pPr>
+        <w:widowControl/>
+        <w:spacing w:after="120"/>
+      </w:pPr>
+      <w:r>
+        <w:rPr>
+          <w:b w:val="0"/>
+        </w:rPr>
+        <w:t>t 的单位为 m。负螺距表示轴上剩余力偶矩与合力方向相反；两者共同保持原力系的外部静力效应。</w:t>
+      </w:r>
+    </w:p>
+    <w:p>
+      <w:pPr>
+        <w:pStyle w:val="Heading1"/>
+        <w:pageBreakBefore/>
+      </w:pPr>
+      <w:r>
+        <w:t>正方体例题的程序运行与验证</w:t>
+      </w:r>
+    </w:p>
+    <w:p>
+      <w:pPr>
+        <w:pStyle w:val="Heading2"/>
+      </w:pPr>
+      <w:r>
+        <w:t>在三维界面中复现</w:t>
+      </w:r>
+    </w:p>
+    <w:p>
+      <w:pPr>
+        <w:widowControl/>
+        <w:spacing w:after="120"/>
+      </w:pPr>
+      <w:r>
+        <w:rPr>
+          <w:b w:val="0"/>
+        </w:rPr>
+        <w:t>启动程序，点击“打开 JSON”，选择 examples/07_cube_assignment.json。项目将载入四个力，简化点 O=(0,0,0) m，附加自由力偶 C=(0,0,0) N·m。右侧应显示“力螺旋”，主矢大小约为 2.449 N，主矩大小约为 1.414 N·m。</w:t>
+      </w:r>
+    </w:p>
+    <w:p>
+      <w:pPr>
+        <w:keepNext/>
+        <w:spacing w:after="0" w:before="0" w:line="240" w:lineRule="auto"/>
+        <w:jc w:val="center"/>
+      </w:pPr>
+      <w:r>
+        <w:drawing>
+          <wp:inline xmlns:a="http://schemas.openxmlformats.org/drawingml/2006/main" xmlns:pic="http://schemas.openxmlformats.org/drawingml/2006/picture">
+            <wp:extent cx="6035040" cy="3819646"/>
+            <wp:docPr id="5" name="Picture 5" descr="指定正方体例题的真实程序运行界面，四个力的分量及作用点已载入，输出力螺旋、主矢主矩和中心轴信息。"/>
+            <wp:cNvGraphicFramePr>
+              <a:graphicFrameLocks noChangeAspect="1"/>
+            </wp:cNvGraphicFramePr>
+            <a:graphic>
+              <a:graphicData uri="http://schemas.openxmlformats.org/drawingml/2006/picture">
+                <pic:pic>
+                  <pic:nvPicPr>
+                    <pic:cNvPr id="0" name="cube_program.png"/>
+                    <pic:cNvPicPr/>
+                  </pic:nvPicPr>
+                  <pic:blipFill>
+                    <a:blip r:embed="rId14"/>
+                    <a:stretch>
+                      <a:fillRect/>
+                    </a:stretch>
+                  </pic:blipFill>
+                  <pic:spPr>
+                    <a:xfrm>
+                      <a:off x="0" y="0"/>
+                      <a:ext cx="6035040" cy="3819646"/>
+                    </a:xfrm>
+                    <a:prstGeom prst="rect"/>
+                  </pic:spPr>
+                </pic:pic>
+              </a:graphicData>
+            </a:graphic>
+          </wp:inline>
+        </w:drawing>
+      </w:r>
+    </w:p>
+    <w:p>
+      <w:pPr>
+        <w:pStyle w:val="Caption"/>
+        <w:keepNext w:val="0"/>
+        <w:spacing w:before="60" w:after="160"/>
+        <w:jc w:val="center"/>
+      </w:pPr>
+      <w:r>
+        <w:t>图 5 正方体指定例题的真实程序运行结果</w:t>
+      </w:r>
+    </w:p>
+    <w:p>
+      <w:pPr>
+        <w:widowControl/>
+        <w:spacing w:after="120"/>
+      </w:pPr>
+      <w:r>
+        <w:rPr>
+          <w:b w:val="0"/>
+        </w:rPr>
+        <w:t>使用“简化到 O”观察原点处的主矢与主矩，使用“最简结果”观察中心轴上的合力与剩余力偶，使用“对照”同时显示原始力与最简力系。图上箭长为分别缩放后的示意长度，数值以结果区为准。</w:t>
+      </w:r>
+    </w:p>
+    <w:p>
+      <w:pPr>
+        <w:pStyle w:val="Heading2"/>
+      </w:pPr>
+      <w:r>
+        <w:t>独立复核与导出</w:t>
+      </w:r>
+    </w:p>
+    <w:p>
+      <w:pPr>
+        <w:widowControl/>
+        <w:spacing w:after="120"/>
+      </w:pPr>
+      <w:r>
+        <w:rPr>
+          <w:b w:val="0"/>
+        </w:rPr>
+        <w:t>将 A 点的合力与轴上剩余力偶重构，可恢复原力系对 O 点的主矩：</w:t>
+      </w:r>
+    </w:p>
+    <w:p>
+      <w:pPr>
+        <w:keepLines/>
+        <w:spacing w:before="40" w:after="80" w:line="269" w:lineRule="auto"/>
+        <w:jc w:val="center"/>
+      </w:pPr>
+      <m:oMathPara>
+        <m:oMathParaPr>
+          <m:jc m:val="center"/>
+        </m:oMathParaPr>
+        <m:oMath>
+          <m:d>
+            <m:dPr>
+              <m:begChr m:val="("/>
+              <m:endChr m:val=")"/>
+            </m:dPr>
+            <m:e>
+              <m:f>
+                <m:num>
+                  <m:r>
+                    <m:rPr/>
+                    <m:t>1</m:t>
+                  </m:r>
+                </m:num>
+                <m:den>
+                  <m:r>
+                    <m:rPr/>
+                    <m:t>2</m:t>
+                  </m:r>
+                </m:den>
+              </m:f>
+              <m:r>
+                <m:rPr/>
+                <m:t>, </m:t>
+              </m:r>
+              <m:f>
+                <m:num>
+                  <m:r>
+                    <m:rPr/>
+                    <m:t>1</m:t>
+                  </m:r>
+                </m:num>
+                <m:den>
+                  <m:r>
+                    <m:rPr/>
+                    <m:t>6</m:t>
+                  </m:r>
+                </m:den>
+              </m:f>
+              <m:r>
+                <m:rPr/>
+                <m:t>, −</m:t>
+              </m:r>
+              <m:f>
+                <m:num>
+                  <m:r>
+                    <m:rPr/>
+                    <m:t>1</m:t>
+                  </m:r>
+                </m:num>
+                <m:den>
+                  <m:r>
+                    <m:rPr/>
+                    <m:t>6</m:t>
+                  </m:r>
+                </m:den>
+              </m:f>
+            </m:e>
+          </m:d>
+          <m:r>
+            <m:rPr/>
+            <m:t> × (1, −1, 2) + </m:t>
+          </m:r>
+          <m:d>
+            <m:dPr>
+              <m:begChr m:val="("/>
+              <m:endChr m:val=")"/>
+            </m:dPr>
+            <m:e>
+              <m:r>
+                <m:rPr/>
+                <m:t>−</m:t>
+              </m:r>
+              <m:f>
+                <m:num>
+                  <m:r>
+                    <m:rPr/>
+                    <m:t>1</m:t>
+                  </m:r>
+                </m:num>
+                <m:den>
+                  <m:r>
+                    <m:rPr/>
+                    <m:t>6</m:t>
+                  </m:r>
+                </m:den>
+              </m:f>
+              <m:r>
+                <m:rPr/>
+                <m:t>, </m:t>
+              </m:r>
+              <m:f>
+                <m:num>
+                  <m:r>
+                    <m:rPr/>
+                    <m:t>1</m:t>
+                  </m:r>
+                </m:num>
+                <m:den>
+                  <m:r>
+                    <m:rPr/>
+                    <m:t>6</m:t>
+                  </m:r>
+                </m:den>
+              </m:f>
+              <m:r>
+                <m:rPr/>
+                <m:t>, −</m:t>
+              </m:r>
+              <m:f>
+                <m:num>
+                  <m:r>
+                    <m:rPr/>
+                    <m:t>1</m:t>
+                  </m:r>
+                </m:num>
+                <m:den>
+                  <m:r>
+                    <m:rPr/>
+                    <m:t>3</m:t>
+                  </m:r>
+                </m:den>
+              </m:f>
+            </m:e>
+          </m:d>
+          <m:r>
+            <m:rPr/>
+            <m:t> = (0, −1, −1)</m:t>
+          </m:r>
+        </m:oMath>
+      </m:oMathPara>
+    </w:p>
+    <w:p>
+      <w:pPr>
+        <w:widowControl/>
+        <w:spacing w:after="120"/>
+      </w:pPr>
+      <w:r>
+        <w:rPr>
+          <w:b w:val="0"/>
+        </w:rPr>
+        <w:t>使用程序未舍入数值复核，力残差为 0 N，矩残差约为 3.15e-16 N·m，符合双精度舍入误差范围。另取中心轴上多个不同点重构，仍得到相同主矢和主矩。</w:t>
+      </w:r>
+    </w:p>
+    <w:p>
+      <w:pPr>
+        <w:pStyle w:val="Code"/>
+      </w:pPr>
+      <w:r>
+        <w:t>python app.py --input examples/07_cube_assignment.json --report cube_report.txt</w:t>
+      </w:r>
+    </w:p>
+    <w:p>
+      <w:pPr>
+        <w:widowControl/>
+        <w:spacing w:after="120"/>
+      </w:pPr>
+      <w:r>
+        <w:rPr>
+          <w:b w:val="0"/>
+        </w:rPr>
+        <w:t>以上命令无需打开图形窗口即可生成数值报告。项目 docs/正方体例题计算结果.txt 保存本例完整输出，包含分量、大小、方向角、中心轴和螺距，便于课堂现场核验。</w:t>
+      </w:r>
+    </w:p>
+    <w:p>
+      <w:pPr>
+        <w:pStyle w:val="Heading1"/>
+        <w:pageBreakBefore/>
+      </w:pPr>
+      <w:r>
+        <w:t>九 补充运行实例 单一合力</w:t>
       </w:r>
     </w:p>
     <w:p>
@@ -4203,7 +6394,7 @@
         <w:drawing>
           <wp:inline xmlns:a="http://schemas.openxmlformats.org/drawingml/2006/main" xmlns:pic="http://schemas.openxmlformats.org/drawingml/2006/picture">
             <wp:extent cx="3840480" cy="2496726"/>
-            <wp:docPr id="4" name="Picture 4" descr="平行力系的程序导出视图，在 XZ 平面显示两个向下力和位于 x=2 的等效合力作用线。"/>
+            <wp:docPr id="6" name="Picture 6" descr="平行力系的程序导出视图，在 XZ 平面显示两个向下力和位于 x=2 的等效合力作用线。"/>
             <wp:cNvGraphicFramePr>
               <a:graphicFrameLocks noChangeAspect="1"/>
             </wp:cNvGraphicFramePr>
@@ -4215,7 +6406,7 @@
                     <pic:cNvPicPr/>
                   </pic:nvPicPr>
                   <pic:blipFill>
-                    <a:blip r:embed="rId13"/>
+                    <a:blip r:embed="rId15"/>
                     <a:stretch>
                       <a:fillRect/>
                     </a:stretch>
@@ -4242,7 +6433,7 @@
         <w:jc w:val="center"/>
       </w:pPr>
       <w:r>
-        <w:t>图 4 平行力系及其合力作用线</w:t>
+        <w:t>图 6 平行力系及其合力作用线</w:t>
       </w:r>
     </w:p>
     <w:p>
@@ -4251,7 +6442,7 @@
         <w:pageBreakBefore/>
       </w:pPr>
       <w:r>
-        <w:t>九 运行实例 力螺旋</w:t>
+        <w:t>十 补充运行实例 力螺旋</w:t>
       </w:r>
     </w:p>
     <w:p>
@@ -5054,7 +7245,7 @@
         <w:drawing>
           <wp:inline xmlns:a="http://schemas.openxmlformats.org/drawingml/2006/main" xmlns:pic="http://schemas.openxmlformats.org/drawingml/2006/picture">
             <wp:extent cx="3794760" cy="2467004"/>
-            <wp:docPr id="5" name="Picture 5" descr="空间力螺旋的程序导出视图，绿色中心轴上的合力与红色反向剩余力偶同时保留。"/>
+            <wp:docPr id="7" name="Picture 7" descr="空间力螺旋的程序导出视图，绿色中心轴上的合力与红色反向剩余力偶同时保留。"/>
             <wp:cNvGraphicFramePr>
               <a:graphicFrameLocks noChangeAspect="1"/>
             </wp:cNvGraphicFramePr>
@@ -5066,7 +7257,7 @@
                     <pic:cNvPicPr/>
                   </pic:nvPicPr>
                   <pic:blipFill>
-                    <a:blip r:embed="rId14"/>
+                    <a:blip r:embed="rId16"/>
                     <a:stretch>
                       <a:fillRect/>
                     </a:stretch>
@@ -5093,7 +7284,7 @@
         <w:jc w:val="center"/>
       </w:pPr>
       <w:r>
-        <w:t>图 5 空间力系及负螺距力螺旋</w:t>
+        <w:t>图 7 空间力系及负螺距力螺旋</w:t>
       </w:r>
     </w:p>
     <w:p>
@@ -5102,7 +7293,7 @@
         <w:pageBreakBefore/>
       </w:pPr>
       <w:r>
-        <w:t>十 运行实例 纯力偶与平衡</w:t>
+        <w:t>十一 补充运行实例 纯力偶与平衡</w:t>
       </w:r>
     </w:p>
     <w:p>
@@ -5207,7 +7398,7 @@
         <w:drawing>
           <wp:inline xmlns:a="http://schemas.openxmlformats.org/drawingml/2006/main" xmlns:pic="http://schemas.openxmlformats.org/drawingml/2006/picture">
             <wp:extent cx="3291840" cy="2140051"/>
-            <wp:docPr id="6" name="Picture 6" descr="纯力偶程序导出图，两个反向非共线力合成为沿负 Z 的自由力偶。"/>
+            <wp:docPr id="8" name="Picture 8" descr="纯力偶程序导出图，两个反向非共线力合成为沿负 Z 的自由力偶。"/>
             <wp:cNvGraphicFramePr>
               <a:graphicFrameLocks noChangeAspect="1"/>
             </wp:cNvGraphicFramePr>
@@ -5219,7 +7410,7 @@
                     <pic:cNvPicPr/>
                   </pic:nvPicPr>
                   <pic:blipFill>
-                    <a:blip r:embed="rId15"/>
+                    <a:blip r:embed="rId17"/>
                     <a:stretch>
                       <a:fillRect/>
                     </a:stretch>
@@ -5246,7 +7437,7 @@
         <w:jc w:val="center"/>
       </w:pPr>
       <w:r>
-        <w:t>图 6 等大反向非共线力的纯力偶结果</w:t>
+        <w:t>图 8 等大反向非共线力的纯力偶结果</w:t>
       </w:r>
     </w:p>
     <w:p>
@@ -5351,7 +7542,7 @@
         <w:drawing>
           <wp:inline xmlns:a="http://schemas.openxmlformats.org/drawingml/2006/main" xmlns:pic="http://schemas.openxmlformats.org/drawingml/2006/picture">
             <wp:extent cx="3017520" cy="1961714"/>
-            <wp:docPr id="7" name="Picture 7" descr="平衡算例程序导出图，两个沿 X 轴共线反向的力，其主矢和主矩同时为零。"/>
+            <wp:docPr id="9" name="Picture 9" descr="平衡算例程序导出图，两个沿 X 轴共线反向的力，其主矢和主矩同时为零。"/>
             <wp:cNvGraphicFramePr>
               <a:graphicFrameLocks noChangeAspect="1"/>
             </wp:cNvGraphicFramePr>
@@ -5363,7 +7554,7 @@
                     <pic:cNvPicPr/>
                   </pic:nvPicPr>
                   <pic:blipFill>
-                    <a:blip r:embed="rId16"/>
+                    <a:blip r:embed="rId18"/>
                     <a:stretch>
                       <a:fillRect/>
                     </a:stretch>
@@ -5390,7 +7581,7 @@
         <w:jc w:val="center"/>
       </w:pPr>
       <w:r>
-        <w:t>图 7 共线反向力的平衡结果</w:t>
+        <w:t>图 9 共线反向力的平衡结果</w:t>
       </w:r>
     </w:p>
     <w:p>
@@ -5399,7 +7590,7 @@
         <w:pageBreakBefore/>
       </w:pPr>
       <w:r>
-        <w:t>十一 结果验证与程序结论</w:t>
+        <w:t>十二 结果验证与程序结论</w:t>
       </w:r>
     </w:p>
     <w:p>
@@ -5758,7 +7949,7 @@
         <w:rPr>
           <w:b w:val="0"/>
         </w:rPr>
-        <w:t>在第八节平行力算例中，将简化点从 O=(0,0,0) 改为 O′=(1,1,0) m。程序计算主矢仍为 (0,0,−300) N，而主矩变为 (300,300,0) N·m。</w:t>
+        <w:t>在第九节平行力算例中，将简化点从 O=(0,0,0) 改为 O′=(1,1,0) m。程序计算主矢仍为 (0,0,−300) N，而主矩变为 (300,300,0) N·m。</w:t>
       </w:r>
     </w:p>
     <w:p>
@@ -5885,7 +8076,7 @@
         <w:pageBreakBefore/>
       </w:pPr>
       <w:r>
-        <w:t>十二 数据格式与复现资料</w:t>
+        <w:t>十三 数据格式与复现资料</w:t>
       </w:r>
     </w:p>
     <w:p>
@@ -5963,7 +8154,7 @@
         <w:rPr>
           <w:b w:val="0"/>
         </w:rPr>
-        <w:t>项目入口为 app.py，力学计算与绘图分别由 mechanics.py 和 scene.py 完成。examples 目录提供六个 JSON 算例；test_*.py 文件为自动化测试。</w:t>
+        <w:t>项目入口为 app.py，力学计算与绘图分别由 mechanics.py 和 scene.py 完成。examples 目录提供七个 JSON 算例，其中 07_cube_assignment.json 为题目指定的正方体力系；test_*.py 文件为自动化测试。</w:t>
       </w:r>
     </w:p>
     <w:p>
@@ -6022,6 +8213,18 @@
           <w:b w:val="0"/>
         </w:rPr>
         <w:t>[2] 空间任意力系简化程序源码及算例，提交 3785ddd。https://github.com/Monkey-cmd/force-system-3d ，仓库为私有，查看需要相应权限。</w:t>
+      </w:r>
+    </w:p>
+    <w:p>
+      <w:pPr>
+        <w:widowControl/>
+        <w:spacing w:after="100"/>
+      </w:pPr>
+      <w:r>
+        <w:rPr>
+          <w:b w:val="0"/>
+        </w:rPr>
+        <w:t>[3] 课程 AI 辅助实践作业课件，所给正方体力系题图，2026年10月18日补入本报告。</w:t>
       </w:r>
     </w:p>
     <w:sectPr>

</xml_diff>